<commit_message>
fix: calibrate Office artifact rendering
</commit_message>
<xml_diff>
--- a/api/assets/resume-reference-one_page.docx
+++ b/api/assets/resume-reference-one_page.docx
@@ -573,6 +573,7 @@
       <w:rFonts w:ascii="Arial" w:hAnsi="Arial" w:cs="Arial" w:eastAsia="Microsoft YaHei"/>
       <w:color w:val="111111"/>
       <w:sz w:val="19"/>
+      <w:szCs w:val="19"/>
     </w:rPr>
   </w:style>
   <w:style w:type="paragraph" w:styleId="BodyText">
@@ -588,6 +589,7 @@
       <w:rFonts w:ascii="Arial" w:hAnsi="Arial" w:cs="Arial" w:eastAsia="Microsoft YaHei"/>
       <w:color w:val="111111"/>
       <w:sz w:val="19"/>
+      <w:szCs w:val="19"/>
     </w:rPr>
   </w:style>
   <w:style w:type="paragraph" w:customStyle="1" w:styleId="FirstParagraph">
@@ -603,6 +605,7 @@
       <w:rFonts w:ascii="Arial" w:hAnsi="Arial" w:cs="Arial" w:eastAsia="Microsoft YaHei"/>
       <w:color w:val="111111"/>
       <w:sz w:val="19"/>
+      <w:szCs w:val="19"/>
     </w:rPr>
   </w:style>
   <w:style w:type="paragraph" w:customStyle="1" w:styleId="Compact">
@@ -619,6 +622,7 @@
       <w:rFonts w:ascii="Arial" w:hAnsi="Arial" w:cs="Arial" w:eastAsia="Microsoft YaHei"/>
       <w:color w:val="111111"/>
       <w:sz w:val="19"/>
+      <w:szCs w:val="19"/>
     </w:rPr>
   </w:style>
   <w:style w:type="paragraph" w:styleId="Title">
@@ -810,7 +814,7 @@
       <w:b/>
       <w:color w:val="111111"/>
       <w:sz w:val="20"/>
-      <w:szCs w:val="32"/>
+      <w:szCs w:val="20"/>
     </w:rPr>
   </w:style>
   <w:style w:type="paragraph" w:styleId="Heading3">
@@ -836,7 +840,7 @@
       <w:b/>
       <w:color w:val="111111"/>
       <w:sz w:val="19"/>
-      <w:szCs w:val="28"/>
+      <w:szCs w:val="20"/>
     </w:rPr>
   </w:style>
   <w:style w:type="paragraph" w:styleId="Heading4">
@@ -1217,6 +1221,7 @@
       <w:rFonts w:ascii="Arial" w:hAnsi="Arial" w:cs="Arial" w:eastAsia="Microsoft YaHei"/>
       <w:color w:val="111111"/>
       <w:sz w:val="19"/>
+      <w:szCs w:val="19"/>
     </w:rPr>
   </w:style>
   <w:style w:type="paragraph" w:customStyle="1" w:styleId="Figure">
@@ -1267,6 +1272,7 @@
       <w:rFonts w:ascii="Arial" w:hAnsi="Arial" w:cs="Arial" w:eastAsia="Microsoft YaHei"/>
       <w:color w:val="111111"/>
       <w:sz w:val="19"/>
+      <w:szCs w:val="19"/>
       <w:u w:val="none"/>
     </w:rPr>
   </w:style>

</xml_diff>